<commit_message>
docs: restore original source documents and keep revisions in requirements
Restore docs/source byte-for-byte to the supplied V1.2 documents. Keep updated requirements under docs/requirements and database design under docs/design; refresh current links and Word references.
</commit_message>
<xml_diff>
--- a/docs/design/wildlife_database_design_v1_4.docx
+++ b/docs/design/wildlife_database_design_v1_4.docx
@@ -52,7 +52,7 @@
         </w:r>
       </w:hyperlink>
       <w:r>
-        <w:t xml:space="preserve">及用户本次业务逻辑图为准；模块 01 保留已审阅详细需求 V1.1 的规则。本次仅修订设计文档，未执行数据库迁移，现有程序仍可能使用初始字段。V1.2 原始需求附件另存于 docs/source/archive，V1.3 数据库设计保留用于追溯。</w:t>
+        <w:t xml:space="preserve">及用户本次业务逻辑图为准；模块 01 保留已审阅详细需求 V1.1 的规则。本次仅修订设计文档，未执行数据库迁移，现有程序仍可能使用初始字段。V1.2 原始需求附件保留于 docs/source，V1.3 数据库设计保留用于追溯。</w:t>
       </w:r>
     </w:p>
     <w:p>
@@ -20637,7 +20637,7 @@
         <w:pStyle w:val="FirstParagraph"/>
       </w:pPr>
       <w:r>
-        <w:t xml:space="preserve">需求基线：docs/requirements/01-camera-sites-and-retrieval.md V1.0；用户审阅原件：docs/reviews/module01-reviewed-2026-10-15.md。初始数据库设计 V1.2 原件保留在 docs/source；原始需求 V1.2 已另存于 docs/source/archive。V1.3 的 Markdown 与 Word 从同一修订内容生成。地形/植被/环境固定选项词表仍需补齐；此项不等于业务表设计或代码实现已完成。</w:t>
+        <w:t xml:space="preserve">需求基线：docs/requirements/01-camera-sites-and-retrieval.md V1.0；用户审阅原件：docs/reviews/module01-reviewed-2026-10-15.md。初始数据库设计 V1.2 原件保留在 docs/source；原始需求 V1.2 保留于 docs/source。V1.3 的 Markdown 与 Word 从同一修订内容生成。地形/植被/环境固定选项词表仍需补齐；此项不等于业务表设计或代码实现已完成。</w:t>
       </w:r>
     </w:p>
     <w:bookmarkEnd w:id="63"/>

</xml_diff>